<commit_message>
Actualiza titulo de la ponencia a 'Inteligencia artificial y justicia constitucional'
</commit_message>
<xml_diff>
--- a/PONENCIA_PRETORIA.docx
+++ b/PONENCIA_PRETORIA.docx
@@ -29,7 +29,7 @@
           <w:szCs w:val="34"/>
           <w:b/>
         </w:rPr>
-        <w:t xml:space="preserve">LA INTELIGENCIA ARTIFICIAL EN LA SELECCIÓN DE TUTELAS</w:t>
+        <w:t xml:space="preserve">INTELIGENCIA ARTIFICIAL Y JUSTICIA CONSTITUCIONAL</w:t>
       </w:r>
     </w:p>
     <w:p>
@@ -44,7 +44,7 @@
           <w:szCs w:val="28"/>
           <w:b/>
         </w:rPr>
-        <w:t xml:space="preserve">Análisis Constitucional Procesal de la Herramienta PretorIA de la Corte Constitucional de Colombia</w:t>
+        <w:t xml:space="preserve">Una evaluación de PretorIA a la luz de los principios constitucionales colombianos</w:t>
       </w:r>
     </w:p>
     <w:p>

</xml_diff>